<commit_message>
Atualiza o arquivo robots.txt para permitir acesso ao logo, revisa o texto do projeto Caserna de Adulão no JavaScript, melhora a extração de texto de documentos DOCX com fallback para PowerShell, e revisa o conteúdo do Guia Mestre, incluindo ajustes no prefácio e metadados. Também realiza melhorias no estilo do protótipo de storytelling.
</commit_message>
<xml_diff>
--- a/fontes/guia-mestre/Guia_Mestre_Discipulando_a_Caserna_v1_0-RC_revisado.docx
+++ b/fontes/guia-mestre/Guia_Mestre_Discipulando_a_Caserna_v1_0-RC_revisado.docx
@@ -1827,130 +1827,21 @@
       </w:r>
     </w:p>
     <w:p>
-      <w:pPr>
-        <w:pStyle w:val="ABNTCorposemrecuo"/>
-        <w:jc w:val="center"/>
+      <w:r>
         <w:rPr>
           <w:b/>
-          <w:bCs/>
-        </w:rPr>
-      </w:pPr>
-      <w:r>
-        <w:rPr>
-          <w:b/>
-          <w:bCs/>
-        </w:rPr>
-        <w:lastRenderedPageBreak/>
-        <w:t>PREFÁCIO</w:t>
-      </w:r>
-    </w:p>
-    <w:p>
-      <w:pPr>
-        <w:pStyle w:val="ABNTCorposemrecuo"/>
-      </w:pPr>
-    </w:p>
-    <w:p>
-      <w:pPr>
-        <w:pStyle w:val="ABNTCorposemrecuo"/>
-      </w:pPr>
-      <w:r>
-        <w:t>Há homens que chegam com o peso de uma história que ninguém escolheria. A farda que um dia representou honra carrega agora a marca da queda, da acusação e do cansaço. Muitos chegam acreditando que Cristo foi embora na hora da desonra — ou que nunca esteve presente para começo de conversa. Este Guia foi escrito para esses homens. E eu conheço esse caminho de perto.</w:t>
-      </w:r>
-    </w:p>
-    <w:p>
-      <w:pPr>
-        <w:pStyle w:val="ABNTCorposemrecuo"/>
-      </w:pPr>
-    </w:p>
-    <w:p>
-      <w:pPr>
-        <w:pStyle w:val="ABNTCorposemrecuo"/>
-      </w:pPr>
-      <w:r>
-        <w:t>Aprendi, ao longo dos anos, que o Evangelho não encontra endereço somente nas igrejas bem iluminadas. Ele entra em salas de disciplina, em alojamentos onde o silêncio pesa mais do que qualquer sentença, em presídios onde homens com farda chegam carregando tanto a culpa real quanto o peso do que ainda não conseguiram nomear. Conheço este caminho não apenas pelo que supervisionei e acompanhei, mas pelo que vivi. E foi nesse chão que Cristo me ensinou que a restauração não é promessa distante — é obra presente do Senhor que entra na caverna e não sai de mãos vazias.</w:t>
-      </w:r>
-    </w:p>
-    <w:p>
-      <w:pPr>
-        <w:pStyle w:val="ABNTCorposemrecuo"/>
-      </w:pPr>
-    </w:p>
-    <w:p>
-      <w:pPr>
-        <w:pStyle w:val="ABNTCorposemrecuo"/>
-      </w:pPr>
-      <w:r>
-        <w:t>O Guia Mestre do Discipulando a Caserna é uma obra que acompanhei de perto, tanto na origem quanto no processo de revisão e validação. Não é material construído à distância da realidade da caserna; nasceu do campo, de encontros reais, de nomes que estão vivos na memória do Projeto. Cada módulo — Cristo chamando, treinando, moldando e enviando — traduz com fidelidade o movimento de graça que vejo acontecer quando um instrutor tem coragem de abrir a Bíblia e ficar com esses homens. Eu o valido pastoralmente porque encontrei nele, página a página, o Cristo que encontro nas Escrituras: o Comandante que chama antes de cobrar, que equipa antes de enviar, e que não abandona o soldado caído no campo.</w:t>
-      </w:r>
-    </w:p>
-    <w:p>
-      <w:pPr>
-        <w:pStyle w:val="ABNTCorposemrecuo"/>
-      </w:pPr>
-    </w:p>
-    <w:p>
-      <w:pPr>
-        <w:pStyle w:val="ABNTCorposemrecuo"/>
-      </w:pPr>
-      <w:r>
-        <w:t>A você, instrutor ou líder que abre este Guia: o que está aqui não é protocolo. É discipulado real, para homens reais, em contexto de pressão real. O método começa na contemplação de Cristo — porque nenhuma disciplina espiritual verdadeira nasce de cobrança, mas de fascínio; nenhuma obediência frutífera nasce de medo, mas de amor. Se você usar este material com fé e humildade, o mesmo Cristo que fez de homens em aperto os valentes de Davi fará o que a graça sempre faz: transformar o quebrantado em enviado.</w:t>
-      </w:r>
-    </w:p>
-    <w:p>
-      <w:pPr>
-        <w:pStyle w:val="ABNTCorposemrecuo"/>
-      </w:pPr>
-    </w:p>
-    <w:p>
-      <w:pPr>
-        <w:pStyle w:val="ABNTCorposemrecuo"/>
-      </w:pPr>
-      <w:r>
-        <w:lastRenderedPageBreak/>
-        <w:t>Que o Senhor guie cada sessão, cada encontro e cada palavra dita a esses homens. O que começou na caverna, que continue pela caserna.</w:t>
-      </w:r>
-    </w:p>
-    <w:p>
-      <w:pPr>
-        <w:pStyle w:val="ABNTCorposemrecuo"/>
-      </w:pPr>
-    </w:p>
-    <w:p>
-      <w:pPr>
-        <w:pStyle w:val="ABNTCorposemrecuo"/>
-        <w:jc w:val="right"/>
-      </w:pPr>
-      <w:r>
-        <w:t>Pr. Glaydston Gama Lopes</w:t>
-      </w:r>
-    </w:p>
-    <w:p>
-      <w:pPr>
-        <w:pStyle w:val="ABNTCorposemrecuo"/>
-        <w:jc w:val="right"/>
-      </w:pPr>
-      <w:r>
-        <w:t>Pastor-presidente do Projeto Caserna de Adulão</w:t>
-      </w:r>
-    </w:p>
-    <w:p>
-      <w:pPr>
-        <w:pStyle w:val="ABNTCorposemrecuo"/>
-        <w:jc w:val="right"/>
-        <w:rPr>
-          <w:b/>
-          <w:bCs/>
-        </w:rPr>
-      </w:pPr>
-      <w:r>
-        <w:t>Fortaleza, 2026</w:t>
-      </w:r>
-      <w:r>
-        <w:rPr>
-          <w:b/>
-          <w:bCs/>
-        </w:rPr>
-        <w:br w:type="page"/>
+        </w:rPr>
+        <w:t xml:space="preserve">PREFÁCIO</w:t>
+      </w:r>
+    </w:p>
+    <w:p>
+      <w:r>
+        <w:t xml:space="preserve">[página reservada ao prefácio pastoral]</w:t>
+      </w:r>
+    </w:p>
+    <w:p>
+      <w:r>
+        <w:t xml:space="preserve">Esta página permanece em branco até que o Pr. Glaydston Gama Lopes, se e quando o entender, redija e envie o texto. Nada abaixo desta linha antecipa autoria, endosso ou homologação pastoral.</w:t>
       </w:r>
     </w:p>
     <w:p>

</xml_diff>